<commit_message>
Draft_043: add Mann-Whitney to Definition of Terms; confirm table refs
Alphabetized entry with U formula. Table 1–7 inline refs verified.
</commit_message>
<xml_diff>
--- a/thesis/003_ThesisProposal_Draft_043.docx
+++ b/thesis/003_ThesisProposal_Draft_043.docx
@@ -2175,6 +2175,32 @@
         <w:rPr>
           <w:rtl w:val="0"/>
         </w:rPr>
+      </w:r>
+    </w:p>
+    <w:p>
+      <w:pPr>
+        <w:spacing w:before="0" w:after="0" w:line="480" w:lineRule="auto"/>
+        <w:ind w:firstLine="720"/>
+        <w:jc w:val="both"/>
+        <w:rPr/>
+      </w:pPr>
+      <w:r>
+        <w:rPr>
+          <w:rFonts w:ascii="Georgia" w:hAnsi="Georgia" w:cs="Georgia" w:eastAsia="Georgia"/>
+          <w:sz w:val="22"/>
+          <w:szCs w:val="22"/>
+          <w:b/>
+          <w:bCs/>
+        </w:rPr>
+        <w:t xml:space="preserve">Mann-Whitney U Test, </w:t>
+      </w:r>
+      <w:r>
+        <w:rPr>
+          <w:rFonts w:ascii="Georgia" w:hAnsi="Georgia" w:cs="Georgia" w:eastAsia="Georgia"/>
+          <w:sz w:val="22"/>
+          <w:szCs w:val="22"/>
+        </w:rPr>
+        <w:t xml:space="preserve">conceptually, the Mann-Whitney U test (also called the Wilcoxon rank-sum test) is a non-parametric test that compares the distributions of a continuous or ordinal variable between two independent groups. Operationally, this study used it as an exploratory post hoc follow-up after the Kruskal-Wallis test, comparing per-abstract hedge rates (hedges per 100 words) for each pair of disciplines. The test statistic is U = n₁n₂ + [n₁(n₁+1)]/2 − R₁, where n₁ and n₂ are the sample sizes of the two groups and R₁ is the sum of ranks for group 1. A Bonferroni correction for three pairwise tests set α = .017. The reported results were Veterinary Medicine versus Biology p = .011, Veterinary Medicine versus Agriculture p = .034, and Agriculture versus Biology p = .72. Only the Biology–Veterinary Medicine contrast remained significant after correction.</w:t>
       </w:r>
     </w:p>
     <w:p>

</xml_diff>